<commit_message>
Update to deal with false positives from scanned documents
If a document is scanned and OCR'ed, it can produce a false positive for overlays. All the text will potentially be identified as overlays when that's not actually the case. The script looks for indicators of that, but not too aggressively as it's better to have false positives that an experienced examiner can review and rule out than to have the script fail to report something (false negative) that should have been reported.
</commit_message>
<xml_diff>
--- a/Application/Documentation/02a_HTML_Reports_Technical.docx
+++ b/Application/Documentation/02a_HTML_Reports_Technical.docx
@@ -111,7 +111,7 @@
           <w:sz w:val="22"/>
           <w:szCs w:val="22"/>
         </w:rPr>
-        <w:t xml:space="preserve">Document Date: October 9, 2026 · Applies to PDF Forensics Suite v1.0.0, build 2026-10-09</w:t>
+        <w:t xml:space="preserve">Document Date: October 13, 2026 · Applies to PDF Forensics Suite v1.0.0, build 2026-10-13</w:t>
       </w:r>
     </w:p>
     <w:p>
@@ -19495,7 +19495,7 @@
           <w:sz w:val="22"/>
           <w:szCs w:val="22"/>
         </w:rPr>
-        <w:t xml:space="preserve">Text over text: glyphs drawn over other glyphs, grouped into clusters within 25 points (CLUSTER_DIST). The detail lists the underlying and overlying glyphs.</w:t>
+        <w:t xml:space="preserve">Text over text: glyphs drawn over other glyphs, grouped into clusters within 25 points (CLUSTER_DIST). The detail lists the underlying and overlying glyphs. Neighbouring letters of the same line of text are not compared with each other, so tightly spaced text, such as OCR output squeezed to fit the scanned word widths, is not reported (since build 2026-10-13).</w:t>
       </w:r>
     </w:p>
     <w:p>

</xml_diff>